<commit_message>
Optimize Week 4 report figures so DOCX deliverable is under 2048 KB limit (1860 KB)
</commit_message>
<xml_diff>
--- a/Agribusiness_Statistical_Modeling_and_Prediction_Report.docx
+++ b/Agribusiness_Statistical_Modeling_and_Prediction_Report.docx
@@ -4754,7 +4754,7 @@
       <w:r>
         <w:drawing>
           <wp:inline xmlns:a="http://schemas.openxmlformats.org/drawingml/2006/main" xmlns:pic="http://schemas.openxmlformats.org/drawingml/2006/picture">
-            <wp:extent cx="5852160" cy="3397285"/>
+            <wp:extent cx="5852160" cy="3398400"/>
             <wp:docPr id="1" name="Picture 1"/>
             <wp:cNvGraphicFramePr>
               <a:graphicFrameLocks noChangeAspect="1"/>
@@ -4775,7 +4775,7 @@
                   <pic:spPr>
                     <a:xfrm>
                       <a:off x="0" y="0"/>
-                      <a:ext cx="5852160" cy="3397285"/>
+                      <a:ext cx="5852160" cy="3398400"/>
                     </a:xfrm>
                     <a:prstGeom prst="rect"/>
                   </pic:spPr>
@@ -4818,7 +4818,7 @@
       <w:r>
         <w:drawing>
           <wp:inline xmlns:a="http://schemas.openxmlformats.org/drawingml/2006/main" xmlns:pic="http://schemas.openxmlformats.org/drawingml/2006/picture">
-            <wp:extent cx="5852160" cy="3219602"/>
+            <wp:extent cx="5852160" cy="3218688"/>
             <wp:docPr id="2" name="Picture 2"/>
             <wp:cNvGraphicFramePr>
               <a:graphicFrameLocks noChangeAspect="1"/>
@@ -4839,7 +4839,7 @@
                   <pic:spPr>
                     <a:xfrm>
                       <a:off x="0" y="0"/>
-                      <a:ext cx="5852160" cy="3219602"/>
+                      <a:ext cx="5852160" cy="3218688"/>
                     </a:xfrm>
                     <a:prstGeom prst="rect"/>
                   </pic:spPr>
@@ -4882,7 +4882,7 @@
       <w:r>
         <w:drawing>
           <wp:inline xmlns:a="http://schemas.openxmlformats.org/drawingml/2006/main" xmlns:pic="http://schemas.openxmlformats.org/drawingml/2006/picture">
-            <wp:extent cx="5852160" cy="4373744"/>
+            <wp:extent cx="5852160" cy="4375447"/>
             <wp:docPr id="3" name="Picture 3"/>
             <wp:cNvGraphicFramePr>
               <a:graphicFrameLocks noChangeAspect="1"/>
@@ -4903,7 +4903,7 @@
                   <pic:spPr>
                     <a:xfrm>
                       <a:off x="0" y="0"/>
-                      <a:ext cx="5852160" cy="4373744"/>
+                      <a:ext cx="5852160" cy="4375447"/>
                     </a:xfrm>
                     <a:prstGeom prst="rect"/>
                   </pic:spPr>
@@ -5975,7 +5975,7 @@
       <w:r>
         <w:drawing>
           <wp:inline xmlns:a="http://schemas.openxmlformats.org/drawingml/2006/main" xmlns:pic="http://schemas.openxmlformats.org/drawingml/2006/picture">
-            <wp:extent cx="5852160" cy="4782757"/>
+            <wp:extent cx="5852160" cy="4784221"/>
             <wp:docPr id="4" name="Picture 4"/>
             <wp:cNvGraphicFramePr>
               <a:graphicFrameLocks noChangeAspect="1"/>
@@ -5996,7 +5996,7 @@
                   <pic:spPr>
                     <a:xfrm>
                       <a:off x="0" y="0"/>
-                      <a:ext cx="5852160" cy="4782757"/>
+                      <a:ext cx="5852160" cy="4784221"/>
                     </a:xfrm>
                     <a:prstGeom prst="rect"/>
                   </pic:spPr>
@@ -8864,7 +8864,7 @@
       <w:r>
         <w:drawing>
           <wp:inline xmlns:a="http://schemas.openxmlformats.org/drawingml/2006/main" xmlns:pic="http://schemas.openxmlformats.org/drawingml/2006/picture">
-            <wp:extent cx="5852160" cy="2665308"/>
+            <wp:extent cx="5852160" cy="2666057"/>
             <wp:docPr id="6" name="Picture 6"/>
             <wp:cNvGraphicFramePr>
               <a:graphicFrameLocks noChangeAspect="1"/>
@@ -8885,7 +8885,7 @@
                   <pic:spPr>
                     <a:xfrm>
                       <a:off x="0" y="0"/>
-                      <a:ext cx="5852160" cy="2665308"/>
+                      <a:ext cx="5852160" cy="2666057"/>
                     </a:xfrm>
                     <a:prstGeom prst="rect"/>
                   </pic:spPr>

</xml_diff>